<commit_message>
docs: add detailed README and update repository structure for separation
</commit_message>
<xml_diff>
--- a/data/软著材料/热带水果数据集采集系统-源代码.docx
+++ b/data/软著材料/热带水果数据集采集系统-源代码.docx
@@ -1114,7 +1114,9 @@
         <w:br/>
         <w:t>import { Capacitor } from '@capacitor/core';</w:t>
         <w:br/>
-        <w:t>import { Directory, Encoding, Filesystem } from '@capacitor/filesystem';</w:t>
+        <w:t>import { Directory, Filesystem } from '@capacitor/filesystem';</w:t>
+        <w:br/>
+        <w:t>import { writeFileSafe, writeTextFileSafe } from './fsUtils';</w:t>
         <w:br/>
         <w:t>import type { FruitRecord } from './types';</w:t>
         <w:br/>
@@ -1124,7 +1126,10 @@
         <w:t>export const PHONE_SAVE_DIR = PHONE_ALBUM_NAME;</w:t>
         <w:br/>
         <w:br/>
-        <w:t>const METADATA_DIR = PHONE_SAVE_DIR;</w:t>
+        <w:t>/** 应用私有目录，与相册名分离，避免 mkdir 冲突 */</w:t>
+        <w:br/>
+        <w:t>const APP_DATA_DIR = 'fruit_records';</w:t>
+        <w:br/>
         <w:br/>
         <w:t>const SAVE_TIMEOUT_MS = 45_000;</w:t>
         <w:br/>
@@ -1190,353 +1195,457 @@
         <w:t>}</w:t>
         <w:br/>
         <w:br/>
-        <w:t>async function ensureMetadataDir(): Promise&lt;void&gt; {</w:t>
-        <w:br/>
-        <w:t xml:space="preserve">  await Filesystem.mkdir({</w:t>
-        <w:br/>
-        <w:t xml:space="preserve">    path: METADATA_DIR,</w:t>
-        <w:br/>
-        <w:t xml:space="preserve">    directory: Directory.External,</w:t>
-        <w:br/>
-        <w:t xml:space="preserve">    recursive: true,</w:t>
+        <w:t>async function ensureAlbum() {</w:t>
+        <w:br/>
+        <w:t xml:space="preserve">  const { albums } = await Media.getAlbums();</w:t>
+        <w:br/>
+        <w:t xml:space="preserve">  let album = albums.find((item) =&gt; item.name === PHONE_ALBUM_NAME);</w:t>
+        <w:br/>
+        <w:t xml:space="preserve">  if (album) {</w:t>
+        <w:br/>
+        <w:t xml:space="preserve">    return album;</w:t>
+        <w:br/>
+        <w:t xml:space="preserve">  }</w:t>
+        <w:br/>
+        <w:br/>
+        <w:t xml:space="preserve">  try {</w:t>
+        <w:br/>
+        <w:t xml:space="preserve">    await Media.createAlbum({ name: PHONE_ALBUM_NAME });</w:t>
+        <w:br/>
+        <w:t xml:space="preserve">  } catch (err) {</w:t>
+        <w:br/>
+        <w:t xml:space="preserve">    console.warn('创建相册失败，尝试查找已有相册', err);</w:t>
+        <w:br/>
+        <w:t xml:space="preserve">  }</w:t>
+        <w:br/>
+        <w:br/>
+        <w:t xml:space="preserve">  const refreshed = await Media.getAlbums();</w:t>
+        <w:br/>
+        <w:t xml:space="preserve">  album = refreshed.albums.find((item) =&gt; item.name === PHONE_ALBUM_NAME);</w:t>
+        <w:br/>
+        <w:t xml:space="preserve">  if (!album) {</w:t>
+        <w:br/>
+        <w:t xml:space="preserve">    throw new Error(`无法创建或找到相册「${PHONE_ALBUM_NAME}」，请检查相册/存储权限`);</w:t>
+        <w:br/>
+        <w:t xml:space="preserve">  }</w:t>
+        <w:br/>
+        <w:t xml:space="preserve">  return album;</w:t>
+        <w:br/>
+        <w:t>}</w:t>
+        <w:br/>
+        <w:br/>
+        <w:t>async function savePhotoToAppDir(dataUrl: string, safeName: string): Promise&lt;string&gt; {</w:t>
+        <w:br/>
+        <w:t xml:space="preserve">  const relativePath = `${APP_DATA_DIR}/${safeName}`;</w:t>
+        <w:br/>
+        <w:t xml:space="preserve">  await writeFileSafe({</w:t>
+        <w:br/>
+        <w:t xml:space="preserve">    path: relativePath,</w:t>
+        <w:br/>
+        <w:t xml:space="preserve">    data: dataUrlToBase64(dataUrl),</w:t>
+        <w:br/>
+        <w:t xml:space="preserve">    directory: Directory.Data,</w:t>
         <w:br/>
         <w:t xml:space="preserve">  });</w:t>
         <w:br/>
+        <w:t xml:space="preserve">  return relativePath;</w:t>
+        <w:br/>
         <w:t>}</w:t>
         <w:br/>
         <w:br/>
-        <w:t>async function savePhotoToAppDir(dataUrl: string, safeName: string): Promise&lt;string&gt; {</w:t>
-        <w:br/>
-        <w:t xml:space="preserve">  await ensureMetadataDir();</w:t>
-        <w:br/>
-        <w:t xml:space="preserve">  await Filesystem.writeFile({</w:t>
-        <w:br/>
-        <w:t xml:space="preserve">    path: `${METADATA_DIR}/${safeName}`,</w:t>
-        <w:br/>
-        <w:t xml:space="preserve">    data: dataUrlToBase64(dataUrl),</w:t>
-        <w:br/>
-        <w:t xml:space="preserve">    directory: Directory.External,</w:t>
+        <w:t>async function savePhotoToGallery(dataUrl: string, storageName: string): Promise&lt;void&gt; {</w:t>
+        <w:br/>
+        <w:t xml:space="preserve">  const album = await ensureAlbum();</w:t>
+        <w:br/>
+        <w:t xml:space="preserve">  const galleryName = storageName.replace(/\.[^.]+$/, '');</w:t>
+        <w:br/>
+        <w:t xml:space="preserve">  await Media.savePhoto({</w:t>
+        <w:br/>
+        <w:t xml:space="preserve">    path: dataUrl,</w:t>
+        <w:br/>
+        <w:t xml:space="preserve">    albumIdentifier: album.identifier,</w:t>
+        <w:br/>
+        <w:t xml:space="preserve">    fileName: galleryName,</w:t>
         <w:br/>
         <w:t xml:space="preserve">  });</w:t>
         <w:br/>
-        <w:t xml:space="preserve">  return `${METADATA_DIR}/${safeName}`;</w:t>
-        <w:br/>
         <w:t>}</w:t>
         <w:br/>
         <w:br/>
-        <w:t>async function savePhotoToGallery(dataUrl: string, storageName: string): Promise&lt;void&gt; {</w:t>
-        <w:br/>
-        <w:t xml:space="preserve">  const tempName = `tmp_${Date.now()}_${storageName}`;</w:t>
-        <w:br/>
-        <w:t xml:space="preserve">  await Filesystem.writeFile({</w:t>
-        <w:br/>
-        <w:t xml:space="preserve">    path: tempName,</w:t>
-        <w:br/>
-        <w:t xml:space="preserve">    data: dataUrlToBase64(dataUrl),</w:t>
-        <w:br/>
-        <w:t xml:space="preserve">    directory: Directory.Cache,</w:t>
+        <w:t>export async function savePhotoToPhone(dataUrl: string, fileName: string): Promise&lt;string&gt; {</w:t>
+        <w:br/>
+        <w:t xml:space="preserve">  const ext = getExtensionFromDataUrl(dataUrl);</w:t>
+        <w:br/>
+        <w:t xml:space="preserve">  const storageName = makeStorageFileName(ext);</w:t>
+        <w:br/>
+        <w:br/>
+        <w:t xml:space="preserve">  if (!Capacitor.isNativePlatform()) {</w:t>
+        <w:br/>
+        <w:t xml:space="preserve">    const blob = await (await fetch(dataUrl)).blob();</w:t>
+        <w:br/>
+        <w:t xml:space="preserve">    const url = URL.createObjectURL(blob);</w:t>
+        <w:br/>
+        <w:t xml:space="preserve">    const anchor = document.createElement('a');</w:t>
+        <w:br/>
+        <w:t xml:space="preserve">    anchor.href = url;</w:t>
+        <w:br/>
+        <w:t xml:space="preserve">    anchor.download = fileName.includes('.') ? fileName : `${fileName}.${ext}`;</w:t>
+        <w:br/>
+        <w:t xml:space="preserve">    anchor.click();</w:t>
+        <w:br/>
+        <w:t xml:space="preserve">    URL.revokeObjectURL(url);</w:t>
+        <w:br/>
+        <w:t xml:space="preserve">    return storageName;</w:t>
+        <w:br/>
+        <w:t xml:space="preserve">  }</w:t>
+        <w:br/>
+        <w:br/>
+        <w:t xml:space="preserve">  let galleryOk = false;</w:t>
+        <w:br/>
+        <w:t xml:space="preserve">  let appOk = false;</w:t>
+        <w:br/>
+        <w:t xml:space="preserve">  let galleryErr: unknown;</w:t>
+        <w:br/>
+        <w:t xml:space="preserve">  let appErr: unknown;</w:t>
+        <w:br/>
+        <w:t xml:space="preserve">  let appPath = `${APP_DATA_DIR}/${storageName}`;</w:t>
+        <w:br/>
+        <w:br/>
+        <w:t xml:space="preserve">  try {</w:t>
+        <w:br/>
+        <w:t xml:space="preserve">    await savePhotoToGallery(dataUrl, storageName);</w:t>
+        <w:br/>
+        <w:t xml:space="preserve">    galleryOk = true;</w:t>
+        <w:br/>
+        <w:t xml:space="preserve">  } catch (err) {</w:t>
+        <w:br/>
+        <w:t xml:space="preserve">    galleryErr = err;</w:t>
+        <w:br/>
+        <w:t xml:space="preserve">    console.warn('相册保存失败', err);</w:t>
+        <w:br/>
+        <w:t xml:space="preserve">  }</w:t>
+        <w:br/>
+        <w:br/>
+        <w:t xml:space="preserve">  try {</w:t>
+        <w:br/>
+        <w:t xml:space="preserve">    appPath = await savePhotoToAppDir(dataUrl, storageName);</w:t>
+        <w:br/>
+        <w:t xml:space="preserve">    appOk = true;</w:t>
+        <w:br/>
+        <w:t xml:space="preserve">  } catch (err) {</w:t>
+        <w:br/>
+        <w:t xml:space="preserve">    appErr = err;</w:t>
+        <w:br/>
+        <w:t xml:space="preserve">    console.warn('应用目录保存失败', err);</w:t>
+        <w:br/>
+        <w:t xml:space="preserve">  }</w:t>
+        <w:br/>
+        <w:br/>
+        <w:t xml:space="preserve">  if (!galleryOk &amp;&amp; !appOk) {</w:t>
+        <w:br/>
+        <w:t xml:space="preserve">    const details = [</w:t>
+        <w:br/>
+        <w:t xml:space="preserve">      galleryErr ? `相册：${toErrorMessage(galleryErr)}` : null,</w:t>
+        <w:br/>
+        <w:t xml:space="preserve">      appErr ? `本地：${toErrorMessage(appErr)}` : null,</w:t>
+        <w:br/>
+        <w:t xml:space="preserve">    ]</w:t>
+        <w:br/>
+        <w:t xml:space="preserve">      .filter(Boolean)</w:t>
+        <w:br/>
+        <w:t xml:space="preserve">      .join('；');</w:t>
+        <w:br/>
+        <w:t xml:space="preserve">    throw new Error(`保存图片失败（${details}）`);</w:t>
+        <w:br/>
+        <w:t xml:space="preserve">  }</w:t>
+        <w:br/>
+        <w:br/>
+        <w:t xml:space="preserve">  return appPath;</w:t>
+        <w:br/>
+        <w:t>}</w:t>
+        <w:br/>
+        <w:br/>
+        <w:t>export async function saveBatchMetadataToPhone(</w:t>
+        <w:br/>
+        <w:t xml:space="preserve">  records: FruitRecord[],</w:t>
+        <w:br/>
+        <w:t xml:space="preserve">  batchName: string,</w:t>
+        <w:br/>
+        <w:t>): Promise&lt;string | null&gt; {</w:t>
+        <w:br/>
+        <w:t xml:space="preserve">  if (!Capacitor.isNativePlatform()) {</w:t>
+        <w:br/>
+        <w:t xml:space="preserve">    return null;</w:t>
+        <w:br/>
+        <w:t xml:space="preserve">  }</w:t>
+        <w:br/>
+        <w:br/>
+        <w:t xml:space="preserve">  const meta = {</w:t>
+        <w:br/>
+        <w:t xml:space="preserve">    savedAt: new Date().toISOString(),</w:t>
+        <w:br/>
+        <w:t xml:space="preserve">    folder: PHONE_ALBUM_NAME,</w:t>
+        <w:br/>
+        <w:t xml:space="preserve">    total: records.length,</w:t>
+        <w:br/>
+        <w:t xml:space="preserve">    records: records.map((r) =&gt; ({</w:t>
+        <w:br/>
+        <w:t xml:space="preserve">      fileName: r.fileName,</w:t>
+        <w:br/>
+        <w:t xml:space="preserve">      savedPath: r.savedPath,</w:t>
+        <w:br/>
+        <w:t xml:space="preserve">      fruitName: r.fruitName,</w:t>
+        <w:br/>
+        <w:t xml:space="preserve">      category: r.category,</w:t>
+        <w:br/>
+        <w:t xml:space="preserve">      weight: r.weight,</w:t>
+        <w:br/>
+        <w:t xml:space="preserve">      color: r.color,</w:t>
+        <w:br/>
+        <w:t xml:space="preserve">      ripeness: r.ripeness,</w:t>
+        <w:br/>
+        <w:t xml:space="preserve">      disease: r.disease,</w:t>
+        <w:br/>
+        <w:t xml:space="preserve">      notes: r.notes,</w:t>
+        <w:br/>
+        <w:t xml:space="preserve">      latitude: r.latitude,</w:t>
+        <w:br/>
+        <w:t xml:space="preserve">      longitude: r.longitude,</w:t>
+        <w:br/>
+        <w:t xml:space="preserve">      createdAt: r.createdAt,</w:t>
+        <w:br/>
+        <w:t xml:space="preserve">    })),</w:t>
+        <w:br/>
+        <w:t xml:space="preserve">  };</w:t>
+        <w:br/>
+        <w:br/>
+        <w:t xml:space="preserve">  const jsonName = `${batchName}.json`;</w:t>
+        <w:br/>
+        <w:t xml:space="preserve">  const jsonPath = `${APP_DATA_DIR}/${jsonName}`;</w:t>
+        <w:br/>
+        <w:t xml:space="preserve">  await writeTextFileSafe(jsonPath, JSON.stringify(meta, null, 2), Directory.Data);</w:t>
+        <w:br/>
+        <w:br/>
+        <w:t xml:space="preserve">  const uri = await Filesystem.getUri({</w:t>
+        <w:br/>
+        <w:t xml:space="preserve">    path: jsonPath,</w:t>
+        <w:br/>
+        <w:t xml:space="preserve">    directory: Directory.Data,</w:t>
         <w:br/>
         <w:t xml:space="preserve">  });</w:t>
         <w:br/>
-        <w:br/>
-        <w:t xml:space="preserve">  const { uri } = await Filesystem.getUri({</w:t>
-        <w:br/>
-        <w:t xml:space="preserve">    path: tempName,</w:t>
-        <w:br/>
-        <w:t xml:space="preserve">    directory: Directory.Cache,</w:t>
-        <w:br/>
-        <w:t xml:space="preserve">  });</w:t>
-        <w:br/>
-        <w:br/>
-        <w:t xml:space="preserve">  const { albums } = await Media.getAlbums();</w:t>
-        <w:br/>
-        <w:t xml:space="preserve">  let album = albums.find((item) =&gt; item.name === PHONE_ALBUM_NAME);</w:t>
-        <w:br/>
-        <w:t xml:space="preserve">  if (!album) {</w:t>
-        <w:br/>
-        <w:t xml:space="preserve">    await Media.createAlbum({ name: PHONE_ALBUM_NAME });</w:t>
-        <w:br/>
-        <w:t xml:space="preserve">    const refreshed = await Media.getAlbums();</w:t>
-        <w:br/>
-        <w:t xml:space="preserve">    album = refreshed.albums.find((item) =&gt; item.name === PHONE_ALBUM_NAME);</w:t>
+        <w:t xml:space="preserve">  return uri.uri;</w:t>
+        <w:br/>
+        <w:t>}</w:t>
+        <w:br/>
+        <w:br/>
+        <w:t>export async function saveRecordsToPhone(records: FruitRecord[]): Promise&lt;{</w:t>
+        <w:br/>
+        <w:t xml:space="preserve">  savedCount: number;</w:t>
+        <w:br/>
+        <w:t xml:space="preserve">  folder: string;</w:t>
+        <w:br/>
+        <w:t xml:space="preserve">  paths: string[];</w:t>
+        <w:br/>
+        <w:t>}&gt; {</w:t>
+        <w:br/>
+        <w:t xml:space="preserve">  const paths: string[] = [];</w:t>
+        <w:br/>
+        <w:br/>
+        <w:t xml:space="preserve">  for (const record of records) {</w:t>
+        <w:br/>
+        <w:t xml:space="preserve">    const ext = getExtensionFromDataUrl(record.photoDataUrl);</w:t>
+        <w:br/>
+        <w:t xml:space="preserve">    const displayName = record.fileName?.includes('.')</w:t>
+        <w:br/>
+        <w:t xml:space="preserve">      ? record.fileName</w:t>
+        <w:br/>
+        <w:t xml:space="preserve">      : `${record.fileName ?? record.id}.${ext}`;</w:t>
+        <w:br/>
+        <w:t xml:space="preserve">    const savedPath = await withTimeout(</w:t>
+        <w:br/>
+        <w:t xml:space="preserve">      savePhotoToPhone(record.photoDataUrl, displayName),</w:t>
+        <w:br/>
+        <w:t xml:space="preserve">      '保存图片',</w:t>
+        <w:br/>
+        <w:t xml:space="preserve">    );</w:t>
+        <w:br/>
+        <w:t xml:space="preserve">    paths.push(savedPath);</w:t>
+        <w:br/>
+        <w:t xml:space="preserve">    record.savedPath = savedPath;</w:t>
         <w:br/>
         <w:t xml:space="preserve">  }</w:t>
         <w:br/>
-        <w:t xml:space="preserve">  if (!album) {</w:t>
-        <w:br/>
-        <w:t xml:space="preserve">    throw new Error(`无法创建相册「${PHONE_ALBUM_NAME}」`);</w:t>
+        <w:br/>
+        <w:t xml:space="preserve">  if (Capacitor.isNativePlatform() &amp;&amp; records.length &gt; 0) {</w:t>
+        <w:br/>
+        <w:t xml:space="preserve">    try {</w:t>
+        <w:br/>
+        <w:t xml:space="preserve">      const batchName = `batch_${Date.now()}`;</w:t>
+        <w:br/>
+        <w:t xml:space="preserve">      await withTimeout(saveBatchMetadataToPhone(records, batchName), '保存批次元数据');</w:t>
+        <w:br/>
+        <w:t xml:space="preserve">    } catch (err) {</w:t>
+        <w:br/>
+        <w:t xml:space="preserve">      console.warn('批次元数据保存失败', err);</w:t>
+        <w:br/>
+        <w:t xml:space="preserve">    }</w:t>
         <w:br/>
         <w:t xml:space="preserve">  }</w:t>
         <w:br/>
         <w:br/>
-        <w:t xml:space="preserve">  const galleryName = storageName.replace(/\.[^.]+$/, '');</w:t>
-        <w:br/>
-        <w:t xml:space="preserve">  await Media.savePhoto({</w:t>
-        <w:br/>
-        <w:t xml:space="preserve">    path: uri,</w:t>
-        <w:br/>
-        <w:t xml:space="preserve">    albumIdentifier: album.identifier,</w:t>
-        <w:br/>
-        <w:t xml:space="preserve">    fileName: galleryName,</w:t>
-        <w:br/>
-        <w:t xml:space="preserve">  });</w:t>
-        <w:br/>
+        <w:t xml:space="preserve">  return {</w:t>
+        <w:br/>
+        <w:t xml:space="preserve">    savedCount: records.length,</w:t>
+        <w:br/>
+        <w:t xml:space="preserve">    folder: PHONE_ALBUM_NAME,</w:t>
+        <w:br/>
+        <w:t xml:space="preserve">    paths,</w:t>
+        <w:br/>
+        <w:t xml:space="preserve">  };</w:t>
+        <w:br/>
+        <w:t>}</w:t>
+        <w:br/>
+        <w:br/>
+        <w:t>export async function readPhotoFromSavedPath(savedPath: string): Promise&lt;string | null&gt; {</w:t>
+        <w:br/>
+        <w:t xml:space="preserve">  if (!Capacitor.isNativePlatform() || !savedPath) {</w:t>
+        <w:br/>
+        <w:t xml:space="preserve">    return null;</w:t>
+        <w:br/>
+        <w:t xml:space="preserve">  }</w:t>
+        <w:br/>
+        <w:br/>
+        <w:t xml:space="preserve">  for (const directory of [Directory.Data, Directory.External]) {</w:t>
+        <w:br/>
+        <w:t xml:space="preserve">    try {</w:t>
+        <w:br/>
+        <w:t xml:space="preserve">      const file = await Filesystem.readFile({ path: savedPath, directory });</w:t>
+        <w:br/>
+        <w:t xml:space="preserve">      const ext = savedPath.toLowerCase().endsWith('.png') ? 'png' : 'jpeg';</w:t>
+        <w:br/>
+        <w:t xml:space="preserve">      return `data:image/${ext};base64,${file.data}`;</w:t>
+        <w:br/>
+        <w:t xml:space="preserve">    } catch {</w:t>
+        <w:br/>
+        <w:t xml:space="preserve">      // 尝试下一个目录（兼容旧版 External 路径）</w:t>
+        <w:br/>
+        <w:t xml:space="preserve">    }</w:t>
+        <w:br/>
+        <w:t xml:space="preserve">  }</w:t>
+        <w:br/>
+        <w:t xml:space="preserve">  return null;</w:t>
+        <w:br/>
+        <w:t>}</w:t>
+        <w:br/>
+        <w:br/>
+        <w:t>export function getPhoneSaveHint(): string {</w:t>
+        <w:br/>
+        <w:t xml:space="preserve">  return Capacitor.isNativePlatform()</w:t>
+        <w:br/>
+        <w:t xml:space="preserve">    ? `图片将保存到手机相册「${PHONE_ALBUM_NAME}」，可在图库中查看`</w:t>
+        <w:br/>
+        <w:t xml:space="preserve">    : '浏览器环境将触发文件下载';</w:t>
+        <w:br/>
+        <w:t>}</w:t>
+        <w:br/>
+      </w:r>
+    </w:p>
+    <w:p>
+      <w:r>
+        <w:t>// ===== src/fsUtils.ts =====</w:t>
+      </w:r>
+    </w:p>
+    <w:p>
+      <w:r>
+        <w:t>import { Directory, Encoding, Filesystem, type WriteFileOptions } from '@capacitor/filesystem';</w:t>
+        <w:br/>
+        <w:br/>
+        <w:t>function toErrorMessage(err: unknown): string {</w:t>
+        <w:br/>
+        <w:t xml:space="preserve">  if (err instanceof Error) {</w:t>
+        <w:br/>
+        <w:t xml:space="preserve">    return err.message;</w:t>
+        <w:br/>
+        <w:t xml:space="preserve">  }</w:t>
+        <w:br/>
+        <w:t xml:space="preserve">  return String(err);</w:t>
+        <w:br/>
+        <w:t>}</w:t>
+        <w:br/>
+        <w:br/>
+        <w:t>function isExistsError(err: unknown): boolean {</w:t>
+        <w:br/>
+        <w:t xml:space="preserve">  const code = (err as { code?: string })?.code;</w:t>
+        <w:br/>
+        <w:t xml:space="preserve">  if (code === 'OS-PLUG-FILE-0010') {</w:t>
+        <w:br/>
+        <w:t xml:space="preserve">    return true;</w:t>
+        <w:br/>
+        <w:t xml:space="preserve">  }</w:t>
+        <w:br/>
+        <w:t xml:space="preserve">  const msg = toErrorMessage(err).toLowerCase();</w:t>
+        <w:br/>
+        <w:t xml:space="preserve">  return msg.includes('already exist') || msg.includes('已经存在');</w:t>
+        <w:br/>
+        <w:t>}</w:t>
+        <w:br/>
+        <w:br/>
+        <w:t>/** mkdir 且忽略目录已存在（Capacitor 不会自动跳过） */</w:t>
+        <w:br/>
+        <w:t>export async function mkdirSafe(path: string, directory: Directory): Promise&lt;void&gt; {</w:t>
         <w:br/>
         <w:t xml:space="preserve">  try {</w:t>
         <w:br/>
-        <w:t xml:space="preserve">    await Filesystem.deleteFile({ path: tempName, directory: Directory.Cache });</w:t>
-        <w:br/>
-        <w:t xml:space="preserve">  } catch {</w:t>
-        <w:br/>
-        <w:t xml:space="preserve">    // 临时文件清理失败不影响主流程</w:t>
+        <w:t xml:space="preserve">    await Filesystem.mkdir({ path, directory, recursive: true });</w:t>
+        <w:br/>
+        <w:t xml:space="preserve">  } catch (err) {</w:t>
+        <w:br/>
+        <w:t xml:space="preserve">    if (!isExistsError(err)) {</w:t>
+        <w:br/>
+        <w:t xml:space="preserve">      throw err;</w:t>
+        <w:br/>
+        <w:t xml:space="preserve">    }</w:t>
         <w:br/>
         <w:t xml:space="preserve">  }</w:t>
         <w:br/>
         <w:t>}</w:t>
         <w:br/>
         <w:br/>
-        <w:t>export async function savePhotoToPhone(dataUrl: string, fileName: string): Promise&lt;string&gt; {</w:t>
-        <w:br/>
-        <w:t xml:space="preserve">  const ext = getExtensionFromDataUrl(dataUrl);</w:t>
-        <w:br/>
-        <w:t xml:space="preserve">  const storageName = makeStorageFileName(ext);</w:t>
-        <w:br/>
-        <w:br/>
-        <w:t xml:space="preserve">  if (Capacitor.isNativePlatform()) {</w:t>
-        <w:br/>
-        <w:t xml:space="preserve">    try {</w:t>
-        <w:br/>
-        <w:t xml:space="preserve">      const appPath = await savePhotoToAppDir(dataUrl, storageName);</w:t>
-        <w:br/>
-        <w:t xml:space="preserve">      try {</w:t>
-        <w:br/>
-        <w:t xml:space="preserve">        await savePhotoToGallery(dataUrl, storageName);</w:t>
-        <w:br/>
-        <w:t xml:space="preserve">      } catch (galleryErr) {</w:t>
-        <w:br/>
-        <w:t xml:space="preserve">        console.warn('相册保存失败，已保留应用目录副本', galleryErr);</w:t>
-        <w:br/>
-        <w:t xml:space="preserve">      }</w:t>
-        <w:br/>
-        <w:t xml:space="preserve">      return appPath;</w:t>
-        <w:br/>
-        <w:t xml:space="preserve">    } catch (err) {</w:t>
-        <w:br/>
-        <w:t xml:space="preserve">      throw new Error(`保存图片失败：${toErrorMessage(err)}`);</w:t>
+        <w:t>/** writeFile + recursive；若因父目录已存在失败则重试一次 */</w:t>
+        <w:br/>
+        <w:t>export async function writeFileSafe(options: WriteFileOptions): Promise&lt;void&gt; {</w:t>
+        <w:br/>
+        <w:t xml:space="preserve">  try {</w:t>
+        <w:br/>
+        <w:t xml:space="preserve">    await Filesystem.writeFile({ ...options, recursive: true });</w:t>
+        <w:br/>
+        <w:t xml:space="preserve">  } catch (err) {</w:t>
+        <w:br/>
+        <w:t xml:space="preserve">    if (!isExistsError(err)) {</w:t>
+        <w:br/>
+        <w:t xml:space="preserve">      throw err;</w:t>
         <w:br/>
         <w:t xml:space="preserve">    }</w:t>
         <w:br/>
+        <w:t xml:space="preserve">    await Filesystem.writeFile(options);</w:t>
+        <w:br/>
         <w:t xml:space="preserve">  }</w:t>
         <w:br/>
-        <w:br/>
-        <w:t xml:space="preserve">  const blob = await (await fetch(dataUrl)).blob();</w:t>
-        <w:br/>
-        <w:t xml:space="preserve">  const url = URL.createObjectURL(blob);</w:t>
-        <w:br/>
-        <w:t xml:space="preserve">  const anchor = document.createElement('a');</w:t>
-        <w:br/>
-        <w:t xml:space="preserve">  anchor.href = url;</w:t>
-        <w:br/>
-        <w:t xml:space="preserve">  anchor.download = fileName.includes('.') ? fileName : `${fileName}.${ext}`;</w:t>
-        <w:br/>
-        <w:t xml:space="preserve">  anchor.click();</w:t>
-        <w:br/>
-        <w:t xml:space="preserve">  URL.revokeObjectURL(url);</w:t>
-        <w:br/>
-        <w:t xml:space="preserve">  return storageName;</w:t>
-        <w:br/>
         <w:t>}</w:t>
         <w:br/>
         <w:br/>
-        <w:t>export async function saveBatchMetadataToPhone(</w:t>
-        <w:br/>
-        <w:t xml:space="preserve">  records: FruitRecord[],</w:t>
-        <w:br/>
-        <w:t xml:space="preserve">  batchName: string,</w:t>
-        <w:br/>
-        <w:t>): Promise&lt;string | null&gt; {</w:t>
-        <w:br/>
-        <w:t xml:space="preserve">  if (!Capacitor.isNativePlatform()) {</w:t>
-        <w:br/>
-        <w:t xml:space="preserve">    return null;</w:t>
-        <w:br/>
-        <w:t xml:space="preserve">  }</w:t>
-        <w:br/>
-        <w:br/>
-        <w:t xml:space="preserve">  await ensureMetadataDir();</w:t>
-        <w:br/>
-        <w:t xml:space="preserve">  const meta = {</w:t>
-        <w:br/>
-        <w:t xml:space="preserve">    savedAt: new Date().toISOString(),</w:t>
-        <w:br/>
-        <w:t xml:space="preserve">    folder: PHONE_ALBUM_NAME,</w:t>
-        <w:br/>
-        <w:t xml:space="preserve">    total: records.length,</w:t>
-        <w:br/>
-        <w:t xml:space="preserve">    records: records.map((r) =&gt; ({</w:t>
-        <w:br/>
-        <w:t xml:space="preserve">      fileName: r.fileName,</w:t>
-        <w:br/>
-        <w:t xml:space="preserve">      savedPath: r.savedPath,</w:t>
-        <w:br/>
-        <w:t xml:space="preserve">      fruitName: r.fruitName,</w:t>
-        <w:br/>
-        <w:t xml:space="preserve">      category: r.category,</w:t>
-        <w:br/>
-        <w:t xml:space="preserve">      weight: r.weight,</w:t>
-        <w:br/>
-        <w:t xml:space="preserve">      color: r.color,</w:t>
-        <w:br/>
-        <w:t xml:space="preserve">      ripeness: r.ripeness,</w:t>
-        <w:br/>
-        <w:t xml:space="preserve">      disease: r.disease,</w:t>
-        <w:br/>
-        <w:t xml:space="preserve">      notes: r.notes,</w:t>
-        <w:br/>
-        <w:t xml:space="preserve">      latitude: r.latitude,</w:t>
-        <w:br/>
-        <w:t xml:space="preserve">      longitude: r.longitude,</w:t>
-        <w:br/>
-        <w:t xml:space="preserve">      createdAt: r.createdAt,</w:t>
-        <w:br/>
-        <w:t xml:space="preserve">    })),</w:t>
-        <w:br/>
-        <w:t xml:space="preserve">  };</w:t>
-        <w:br/>
-        <w:br/>
-        <w:t xml:space="preserve">  const jsonName = `${batchName}.json`;</w:t>
-        <w:br/>
-        <w:t xml:space="preserve">  await Filesystem.writeFile({</w:t>
-        <w:br/>
-        <w:t xml:space="preserve">    path: `${METADATA_DIR}/${jsonName}`,</w:t>
-        <w:br/>
-        <w:t xml:space="preserve">    data: JSON.stringify(meta, null, 2),</w:t>
-        <w:br/>
-        <w:t xml:space="preserve">    directory: Directory.External,</w:t>
-        <w:br/>
-        <w:t xml:space="preserve">    encoding: Encoding.UTF8,</w:t>
-        <w:br/>
-        <w:t xml:space="preserve">  });</w:t>
-        <w:br/>
-        <w:br/>
-        <w:t xml:space="preserve">  const uri = await Filesystem.getUri({</w:t>
-        <w:br/>
-        <w:t xml:space="preserve">    path: `${METADATA_DIR}/${jsonName}`,</w:t>
-        <w:br/>
-        <w:t xml:space="preserve">    directory: Directory.External,</w:t>
-        <w:br/>
-        <w:t xml:space="preserve">  });</w:t>
-        <w:br/>
-        <w:t xml:space="preserve">  return uri.uri;</w:t>
-        <w:br/>
-        <w:t>}</w:t>
-        <w:br/>
-        <w:br/>
-        <w:t>export async function saveRecordsToPhone(records: FruitRecord[]): Promise&lt;{</w:t>
-        <w:br/>
-        <w:t xml:space="preserve">  savedCount: number;</w:t>
-        <w:br/>
-        <w:t xml:space="preserve">  folder: string;</w:t>
-        <w:br/>
-        <w:t xml:space="preserve">  paths: string[];</w:t>
-        <w:br/>
-        <w:t>}&gt; {</w:t>
-        <w:br/>
-        <w:t xml:space="preserve">  const paths: string[] = [];</w:t>
-        <w:br/>
-        <w:br/>
-        <w:t xml:space="preserve">  for (const record of records) {</w:t>
-        <w:br/>
-        <w:t xml:space="preserve">    const ext = getExtensionFromDataUrl(record.photoDataUrl);</w:t>
-        <w:br/>
-        <w:t xml:space="preserve">    const displayName = record.fileName?.includes('.')</w:t>
-        <w:br/>
-        <w:t xml:space="preserve">      ? record.fileName</w:t>
-        <w:br/>
-        <w:t xml:space="preserve">      : `${record.fileName ?? record.id}.${ext}`;</w:t>
-        <w:br/>
-        <w:t xml:space="preserve">    const savedPath = await withTimeout(</w:t>
-        <w:br/>
-        <w:t xml:space="preserve">      savePhotoToPhone(record.photoDataUrl, displayName),</w:t>
-        <w:br/>
-        <w:t xml:space="preserve">      '保存图片',</w:t>
-        <w:br/>
-        <w:t xml:space="preserve">    );</w:t>
-        <w:br/>
-        <w:t xml:space="preserve">    paths.push(savedPath);</w:t>
-        <w:br/>
-        <w:t xml:space="preserve">    record.savedPath = savedPath;</w:t>
-        <w:br/>
-        <w:t xml:space="preserve">  }</w:t>
-        <w:br/>
-        <w:br/>
-        <w:t xml:space="preserve">  if (Capacitor.isNativePlatform() &amp;&amp; records.length &gt; 0) {</w:t>
-        <w:br/>
-        <w:t xml:space="preserve">    try {</w:t>
-        <w:br/>
-        <w:t xml:space="preserve">      const batchName = `batch_${Date.now()}`;</w:t>
-        <w:br/>
-        <w:t xml:space="preserve">      await withTimeout(saveBatchMetadataToPhone(records, batchName), '保存批次元数据');</w:t>
-        <w:br/>
-        <w:t xml:space="preserve">    } catch (err) {</w:t>
-        <w:br/>
-        <w:t xml:space="preserve">      console.warn('批次元数据保存失败', err);</w:t>
-        <w:br/>
-        <w:t xml:space="preserve">    }</w:t>
-        <w:br/>
-        <w:t xml:space="preserve">  }</w:t>
-        <w:br/>
-        <w:br/>
-        <w:t xml:space="preserve">  return {</w:t>
-        <w:br/>
-        <w:t xml:space="preserve">    savedCount: records.length,</w:t>
-        <w:br/>
-        <w:t xml:space="preserve">    folder: PHONE_ALBUM_NAME,</w:t>
-        <w:br/>
-        <w:t xml:space="preserve">    paths,</w:t>
-        <w:br/>
-        <w:t xml:space="preserve">  };</w:t>
-        <w:br/>
-        <w:t>}</w:t>
-        <w:br/>
-        <w:br/>
-        <w:t>export async function readPhotoFromSavedPath(savedPath: string): Promise&lt;string | null&gt; {</w:t>
-        <w:br/>
-        <w:t xml:space="preserve">  if (!Capacitor.isNativePlatform() || !savedPath) {</w:t>
-        <w:br/>
-        <w:t xml:space="preserve">    return null;</w:t>
-        <w:br/>
-        <w:t xml:space="preserve">  }</w:t>
-        <w:br/>
-        <w:br/>
-        <w:t xml:space="preserve">  try {</w:t>
-        <w:br/>
-        <w:t xml:space="preserve">    const file = await Filesystem.readFile({</w:t>
-        <w:br/>
-        <w:t xml:space="preserve">      path: savedPath,</w:t>
-        <w:br/>
-        <w:t xml:space="preserve">      directory: Directory.External,</w:t>
-        <w:br/>
-        <w:t xml:space="preserve">    });</w:t>
-        <w:br/>
-        <w:t xml:space="preserve">    return `data:image/jpeg;base64,${file.data}`;</w:t>
-        <w:br/>
-        <w:t xml:space="preserve">  } catch {</w:t>
-        <w:br/>
-        <w:t xml:space="preserve">    return null;</w:t>
-        <w:br/>
-        <w:t xml:space="preserve">  }</w:t>
-        <w:br/>
-        <w:t>}</w:t>
-        <w:br/>
-        <w:br/>
-        <w:t>export function getPhoneSaveHint(): string {</w:t>
-        <w:br/>
-        <w:t xml:space="preserve">  return Capacitor.isNativePlatform()</w:t>
-        <w:br/>
-        <w:t xml:space="preserve">    ? `图片将保存到手机相册「${PHONE_ALBUM_NAME}」，可在图库中查看`</w:t>
-        <w:br/>
-        <w:t xml:space="preserve">    : '浏览器环境将触发文件下载';</w:t>
+        <w:t>export async function writeTextFileSafe(</w:t>
+        <w:br/>
+        <w:t xml:space="preserve">  path: string,</w:t>
+        <w:br/>
+        <w:t xml:space="preserve">  data: string,</w:t>
+        <w:br/>
+        <w:t xml:space="preserve">  directory: Directory,</w:t>
+        <w:br/>
+        <w:t>): Promise&lt;void&gt; {</w:t>
+        <w:br/>
+        <w:t xml:space="preserve">  await writeFileSafe({ path, data, directory, encoding: Encoding.UTF8 });</w:t>
         <w:br/>
         <w:t>}</w:t>
         <w:br/>
@@ -1671,6 +1780,8 @@
         <w:br/>
         <w:t>import { readPhotoFromSavedPath } from './fileStorage';</w:t>
         <w:br/>
+        <w:t>import { mkdirSafe } from './fsUtils';</w:t>
+        <w:br/>
         <w:t>import type { FruitRecord } from './types';</w:t>
         <w:br/>
         <w:br/>
@@ -1884,299 +1995,294 @@
         <w:t xml:space="preserve">  const folderName = safeName;</w:t>
         <w:br/>
         <w:br/>
-        <w:t xml:space="preserve">  await Filesystem.mkdir({</w:t>
-        <w:br/>
-        <w:t xml:space="preserve">    path: folderName,</w:t>
+        <w:t xml:space="preserve">  await mkdirSafe(folderName, Directory.Cache);</w:t>
+        <w:br/>
+        <w:t xml:space="preserve">  await mkdirSafe(`${folderName}/images`, Directory.Cache);</w:t>
+        <w:br/>
+        <w:br/>
+        <w:t xml:space="preserve">  await Filesystem.writeFile({</w:t>
+        <w:br/>
+        <w:t xml:space="preserve">    path: `${folderName}/dataset.json`,</w:t>
+        <w:br/>
+        <w:t xml:space="preserve">    data: JSON.stringify(bundle, null, 2),</w:t>
         <w:br/>
         <w:t xml:space="preserve">    directory: Directory.Cache,</w:t>
         <w:br/>
-        <w:t xml:space="preserve">    recursive: true,</w:t>
+        <w:t xml:space="preserve">    encoding: Encoding.UTF8,</w:t>
         <w:br/>
         <w:t xml:space="preserve">  });</w:t>
         <w:br/>
         <w:br/>
-        <w:t xml:space="preserve">  await Filesystem.mkdir({</w:t>
-        <w:br/>
-        <w:t xml:space="preserve">    path: `${folderName}/images`,</w:t>
+        <w:t xml:space="preserve">  for (let i = 0; i &lt; records.length; i++) {</w:t>
+        <w:br/>
+        <w:t xml:space="preserve">    const record = records[i];</w:t>
+        <w:br/>
+        <w:t xml:space="preserve">    const meta = bundle.records[i];</w:t>
+        <w:br/>
+        <w:t xml:space="preserve">    const photoDataUrl = await resolveRecordPhoto(record);</w:t>
+        <w:br/>
+        <w:t xml:space="preserve">    await Filesystem.writeFile({</w:t>
+        <w:br/>
+        <w:t xml:space="preserve">      path: `${folderName}/${meta.imageFile}`,</w:t>
+        <w:br/>
+        <w:t xml:space="preserve">      data: dataUrlToBase64(photoDataUrl),</w:t>
+        <w:br/>
+        <w:t xml:space="preserve">      directory: Directory.Cache,</w:t>
+        <w:br/>
+        <w:t xml:space="preserve">    });</w:t>
+        <w:br/>
+        <w:t xml:space="preserve">  }</w:t>
+        <w:br/>
+        <w:br/>
+        <w:t xml:space="preserve">  const csvHeader =</w:t>
+        <w:br/>
+        <w:t xml:space="preserve">    'id,imageFile,fruitName,category,weight,color,ripeness,disease,notes,latitude,longitude,createdAt,updatedAt';</w:t>
+        <w:br/>
+        <w:t xml:space="preserve">  const csvRows = bundle.records.map((item) =&gt;</w:t>
+        <w:br/>
+        <w:t xml:space="preserve">    [</w:t>
+        <w:br/>
+        <w:t xml:space="preserve">      item.id,</w:t>
+        <w:br/>
+        <w:t xml:space="preserve">      item.imageFile,</w:t>
+        <w:br/>
+        <w:t xml:space="preserve">      item.fruitName,</w:t>
+        <w:br/>
+        <w:t xml:space="preserve">      item.category,</w:t>
+        <w:br/>
+        <w:t xml:space="preserve">      item.weight ?? '',</w:t>
+        <w:br/>
+        <w:t xml:space="preserve">      item.color ?? '',</w:t>
+        <w:br/>
+        <w:t xml:space="preserve">      item.ripeness ?? '',</w:t>
+        <w:br/>
+        <w:t xml:space="preserve">      item.disease ?? '',</w:t>
+        <w:br/>
+        <w:t xml:space="preserve">      (item.notes ?? '').replace(/"/g, '""'),</w:t>
+        <w:br/>
+        <w:t xml:space="preserve">      item.latitude ?? '',</w:t>
+        <w:br/>
+        <w:t xml:space="preserve">      item.longitude ?? '',</w:t>
+        <w:br/>
+        <w:t xml:space="preserve">      item.createdAt,</w:t>
+        <w:br/>
+        <w:t xml:space="preserve">      item.updatedAt,</w:t>
+        <w:br/>
+        <w:t xml:space="preserve">    ]</w:t>
+        <w:br/>
+        <w:t xml:space="preserve">      .map((v) =&gt; `"${String(v)}"`)</w:t>
+        <w:br/>
+        <w:t xml:space="preserve">      .join(','),</w:t>
+        <w:br/>
+        <w:t xml:space="preserve">  );</w:t>
+        <w:br/>
+        <w:br/>
+        <w:t xml:space="preserve">  await Filesystem.writeFile({</w:t>
+        <w:br/>
+        <w:t xml:space="preserve">    path: `${folderName}/dataset.csv`,</w:t>
+        <w:br/>
+        <w:t xml:space="preserve">    data: [csvHeader, ...csvRows].join('\n'),</w:t>
         <w:br/>
         <w:t xml:space="preserve">    directory: Directory.Cache,</w:t>
         <w:br/>
-        <w:t xml:space="preserve">    recursive: true,</w:t>
+        <w:t xml:space="preserve">    encoding: Encoding.UTF8,</w:t>
         <w:br/>
         <w:t xml:space="preserve">  });</w:t>
         <w:br/>
         <w:br/>
-        <w:t xml:space="preserve">  await Filesystem.writeFile({</w:t>
+        <w:t xml:space="preserve">  const jsonUri = await Filesystem.getUri({</w:t>
         <w:br/>
         <w:t xml:space="preserve">    path: `${folderName}/dataset.json`,</w:t>
         <w:br/>
-        <w:t xml:space="preserve">    data: JSON.stringify(bundle, null, 2),</w:t>
-        <w:br/>
         <w:t xml:space="preserve">    directory: Directory.Cache,</w:t>
         <w:br/>
-        <w:t xml:space="preserve">    encoding: Encoding.UTF8,</w:t>
-        <w:br/>
         <w:t xml:space="preserve">  });</w:t>
         <w:br/>
         <w:br/>
-        <w:t xml:space="preserve">  for (let i = 0; i &lt; records.length; i++) {</w:t>
-        <w:br/>
-        <w:t xml:space="preserve">    const record = records[i];</w:t>
-        <w:br/>
-        <w:t xml:space="preserve">    const meta = bundle.records[i];</w:t>
-        <w:br/>
-        <w:t xml:space="preserve">    const photoDataUrl = await resolveRecordPhoto(record);</w:t>
-        <w:br/>
-        <w:t xml:space="preserve">    await Filesystem.writeFile({</w:t>
-        <w:br/>
-        <w:t xml:space="preserve">      path: `${folderName}/${meta.imageFile}`,</w:t>
-        <w:br/>
-        <w:t xml:space="preserve">      data: dataUrlToBase64(photoDataUrl),</w:t>
-        <w:br/>
-        <w:t xml:space="preserve">      directory: Directory.Cache,</w:t>
-        <w:br/>
-        <w:t xml:space="preserve">    });</w:t>
+        <w:t xml:space="preserve">  await shareExport({</w:t>
+        <w:br/>
+        <w:t xml:space="preserve">    title: safeName,</w:t>
+        <w:br/>
+        <w:t xml:space="preserve">    text: `已导出「${safeName}」共 ${records.length} 条记录，包含 JSON、CSV 和图片文件`,</w:t>
+        <w:br/>
+        <w:t xml:space="preserve">    url: jsonUri.uri,</w:t>
+        <w:br/>
+        <w:t xml:space="preserve">  });</w:t>
+        <w:br/>
+        <w:br/>
+        <w:t xml:space="preserve">  return jsonUri.uri;</w:t>
+        <w:br/>
+        <w:t>}</w:t>
+        <w:br/>
+        <w:br/>
+        <w:t>async function shareExport(options: {</w:t>
+        <w:br/>
+        <w:t xml:space="preserve">  title: string;</w:t>
+        <w:br/>
+        <w:t xml:space="preserve">  text: string;</w:t>
+        <w:br/>
+        <w:t xml:space="preserve">  url: string;</w:t>
+        <w:br/>
+        <w:t>}): Promise&lt;void&gt; {</w:t>
+        <w:br/>
+        <w:t xml:space="preserve">  const canShare = await Share.canShare();</w:t>
+        <w:br/>
+        <w:t xml:space="preserve">  if (!canShare.value) {</w:t>
+        <w:br/>
+        <w:t xml:space="preserve">    throw new Error('当前设备不支持分享，导出文件已写入应用缓存');</w:t>
         <w:br/>
         <w:t xml:space="preserve">  }</w:t>
         <w:br/>
         <w:br/>
-        <w:t xml:space="preserve">  const csvHeader =</w:t>
-        <w:br/>
-        <w:t xml:space="preserve">    'id,imageFile,fruitName,category,weight,color,ripeness,disease,notes,latitude,longitude,createdAt,updatedAt';</w:t>
-        <w:br/>
-        <w:t xml:space="preserve">  const csvRows = bundle.records.map((item) =&gt;</w:t>
-        <w:br/>
-        <w:t xml:space="preserve">    [</w:t>
-        <w:br/>
-        <w:t xml:space="preserve">      item.id,</w:t>
-        <w:br/>
-        <w:t xml:space="preserve">      item.imageFile,</w:t>
-        <w:br/>
-        <w:t xml:space="preserve">      item.fruitName,</w:t>
-        <w:br/>
-        <w:t xml:space="preserve">      item.category,</w:t>
-        <w:br/>
-        <w:t xml:space="preserve">      item.weight ?? '',</w:t>
-        <w:br/>
-        <w:t xml:space="preserve">      item.color ?? '',</w:t>
-        <w:br/>
-        <w:t xml:space="preserve">      item.ripeness ?? '',</w:t>
-        <w:br/>
-        <w:t xml:space="preserve">      item.disease ?? '',</w:t>
-        <w:br/>
-        <w:t xml:space="preserve">      (item.notes ?? '').replace(/"/g, '""'),</w:t>
-        <w:br/>
-        <w:t xml:space="preserve">      item.latitude ?? '',</w:t>
-        <w:br/>
-        <w:t xml:space="preserve">      item.longitude ?? '',</w:t>
-        <w:br/>
-        <w:t xml:space="preserve">      item.createdAt,</w:t>
-        <w:br/>
-        <w:t xml:space="preserve">      item.updatedAt,</w:t>
-        <w:br/>
-        <w:t xml:space="preserve">    ]</w:t>
-        <w:br/>
-        <w:t xml:space="preserve">      .map((v) =&gt; `"${String(v)}"`)</w:t>
-        <w:br/>
-        <w:t xml:space="preserve">      .join(','),</w:t>
+        <w:t xml:space="preserve">  try {</w:t>
+        <w:br/>
+        <w:t xml:space="preserve">    await Promise.race([</w:t>
+        <w:br/>
+        <w:t xml:space="preserve">      Share.share({</w:t>
+        <w:br/>
+        <w:t xml:space="preserve">        title: options.title,</w:t>
+        <w:br/>
+        <w:t xml:space="preserve">        text: options.text,</w:t>
+        <w:br/>
+        <w:t xml:space="preserve">        url: options.url,</w:t>
+        <w:br/>
+        <w:t xml:space="preserve">        dialogTitle: '分享数据集',</w:t>
+        <w:br/>
+        <w:t xml:space="preserve">      }),</w:t>
+        <w:br/>
+        <w:t xml:space="preserve">      new Promise&lt;void&gt;((_, reject) =&gt; {</w:t>
+        <w:br/>
+        <w:t xml:space="preserve">        setTimeout(() =&gt; reject(new Error('SHARE_TIMEOUT')), 90_000);</w:t>
+        <w:br/>
+        <w:t xml:space="preserve">      }),</w:t>
+        <w:br/>
+        <w:t xml:space="preserve">    ]);</w:t>
+        <w:br/>
+        <w:t xml:space="preserve">  } catch (err) {</w:t>
+        <w:br/>
+        <w:t xml:space="preserve">    const message = err instanceof Error ? err.message : String(err);</w:t>
+        <w:br/>
+        <w:t xml:space="preserve">    if (</w:t>
+        <w:br/>
+        <w:t xml:space="preserve">      message === 'SHARE_TIMEOUT' ||</w:t>
+        <w:br/>
+        <w:t xml:space="preserve">      /cancel|dismiss|abort|closed|user/i.test(message)</w:t>
+        <w:br/>
+        <w:t xml:space="preserve">    ) {</w:t>
+        <w:br/>
+        <w:t xml:space="preserve">      return;</w:t>
+        <w:br/>
+        <w:t xml:space="preserve">    }</w:t>
+        <w:br/>
+        <w:t xml:space="preserve">    throw err;</w:t>
+        <w:br/>
+        <w:t xml:space="preserve">  }</w:t>
+        <w:br/>
+        <w:t>}</w:t>
+        <w:br/>
+        <w:br/>
+        <w:t>export async function exportDatasetWeb(options: ExportOptions): Promise&lt;void&gt; {</w:t>
+        <w:br/>
+        <w:t xml:space="preserve">  const { records, datasetName } = options;</w:t>
+        <w:br/>
+        <w:t xml:space="preserve">  const safeName = sanitizeExportName(datasetName);</w:t>
+        <w:br/>
+        <w:t xml:space="preserve">  const bundle = await buildExportBundle(records, safeName);</w:t>
+        <w:br/>
+        <w:t xml:space="preserve">  const exportRecords = await Promise.all(</w:t>
+        <w:br/>
+        <w:t xml:space="preserve">    bundle.records.map(async (meta, index) =&gt; ({</w:t>
+        <w:br/>
+        <w:t xml:space="preserve">      ...meta,</w:t>
+        <w:br/>
+        <w:t xml:space="preserve">      imageBase64: dataUrlToBase64(await resolveRecordPhoto(records[index])),</w:t>
+        <w:br/>
+        <w:t xml:space="preserve">    })),</w:t>
         <w:br/>
         <w:t xml:space="preserve">  );</w:t>
         <w:br/>
-        <w:br/>
-        <w:t xml:space="preserve">  await Filesystem.writeFile({</w:t>
-        <w:br/>
-        <w:t xml:space="preserve">    path: `${folderName}/dataset.csv`,</w:t>
-        <w:br/>
-        <w:t xml:space="preserve">    data: [csvHeader, ...csvRows].join('\n'),</w:t>
-        <w:br/>
-        <w:t xml:space="preserve">    directory: Directory.Cache,</w:t>
-        <w:br/>
-        <w:t xml:space="preserve">    encoding: Encoding.UTF8,</w:t>
+        <w:t xml:space="preserve">  const exportData = {</w:t>
+        <w:br/>
+        <w:t xml:space="preserve">    ...bundle,</w:t>
+        <w:br/>
+        <w:t xml:space="preserve">    records: exportRecords,</w:t>
+        <w:br/>
+        <w:t xml:space="preserve">  };</w:t>
+        <w:br/>
+        <w:br/>
+        <w:t xml:space="preserve">  const blob = new Blob([JSON.stringify(exportData, null, 2)], {</w:t>
+        <w:br/>
+        <w:t xml:space="preserve">    type: 'application/json',</w:t>
         <w:br/>
         <w:t xml:space="preserve">  });</w:t>
         <w:br/>
-        <w:br/>
-        <w:t xml:space="preserve">  const jsonUri = await Filesystem.getUri({</w:t>
-        <w:br/>
-        <w:t xml:space="preserve">    path: `${folderName}/dataset.json`,</w:t>
-        <w:br/>
-        <w:t xml:space="preserve">    directory: Directory.Cache,</w:t>
-        <w:br/>
-        <w:t xml:space="preserve">  });</w:t>
-        <w:br/>
-        <w:br/>
-        <w:t xml:space="preserve">  await shareExport({</w:t>
-        <w:br/>
-        <w:t xml:space="preserve">    title: safeName,</w:t>
-        <w:br/>
-        <w:t xml:space="preserve">    text: `已导出「${safeName}」共 ${records.length} 条记录，包含 JSON、CSV 和图片文件`,</w:t>
-        <w:br/>
-        <w:t xml:space="preserve">    url: jsonUri.uri,</w:t>
-        <w:br/>
-        <w:t xml:space="preserve">  });</w:t>
-        <w:br/>
-        <w:br/>
-        <w:t xml:space="preserve">  return jsonUri.uri;</w:t>
+        <w:t xml:space="preserve">  const url = URL.createObjectURL(blob);</w:t>
+        <w:br/>
+        <w:t xml:space="preserve">  const anchor = document.createElement('a');</w:t>
+        <w:br/>
+        <w:t xml:space="preserve">  anchor.href = url;</w:t>
+        <w:br/>
+        <w:t xml:space="preserve">  anchor.download = `${safeName}.json`;</w:t>
+        <w:br/>
+        <w:t xml:space="preserve">  anchor.click();</w:t>
+        <w:br/>
+        <w:t xml:space="preserve">  URL.revokeObjectURL(url);</w:t>
         <w:br/>
         <w:t>}</w:t>
         <w:br/>
         <w:br/>
-        <w:t>async function shareExport(options: {</w:t>
-        <w:br/>
-        <w:t xml:space="preserve">  title: string;</w:t>
-        <w:br/>
-        <w:t xml:space="preserve">  text: string;</w:t>
-        <w:br/>
-        <w:t xml:space="preserve">  url: string;</w:t>
-        <w:br/>
-        <w:t>}): Promise&lt;void&gt; {</w:t>
-        <w:br/>
-        <w:t xml:space="preserve">  const canShare = await Share.canShare();</w:t>
-        <w:br/>
-        <w:t xml:space="preserve">  if (!canShare.value) {</w:t>
-        <w:br/>
-        <w:t xml:space="preserve">    throw new Error('当前设备不支持分享，导出文件已写入应用缓存');</w:t>
+        <w:t>export async function exportDataset(options: ExportOptions): Promise&lt;void&gt; {</w:t>
+        <w:br/>
+        <w:t xml:space="preserve">  const { records, datasetName } = options;</w:t>
+        <w:br/>
+        <w:br/>
+        <w:t xml:space="preserve">  if (!datasetName.trim()) {</w:t>
+        <w:br/>
+        <w:t xml:space="preserve">    throw new Error('请输入导出数据集名称');</w:t>
         <w:br/>
         <w:t xml:space="preserve">  }</w:t>
         <w:br/>
         <w:br/>
-        <w:t xml:space="preserve">  try {</w:t>
-        <w:br/>
-        <w:t xml:space="preserve">    await Promise.race([</w:t>
-        <w:br/>
-        <w:t xml:space="preserve">      Share.share({</w:t>
-        <w:br/>
-        <w:t xml:space="preserve">        title: options.title,</w:t>
-        <w:br/>
-        <w:t xml:space="preserve">        text: options.text,</w:t>
-        <w:br/>
-        <w:t xml:space="preserve">        url: options.url,</w:t>
-        <w:br/>
-        <w:t xml:space="preserve">        dialogTitle: '分享数据集',</w:t>
-        <w:br/>
-        <w:t xml:space="preserve">      }),</w:t>
-        <w:br/>
-        <w:t xml:space="preserve">      new Promise&lt;void&gt;((_, reject) =&gt; {</w:t>
-        <w:br/>
-        <w:t xml:space="preserve">        setTimeout(() =&gt; reject(new Error('SHARE_TIMEOUT')), 90_000);</w:t>
-        <w:br/>
-        <w:t xml:space="preserve">      }),</w:t>
-        <w:br/>
-        <w:t xml:space="preserve">    ]);</w:t>
-        <w:br/>
-        <w:t xml:space="preserve">  } catch (err) {</w:t>
-        <w:br/>
-        <w:t xml:space="preserve">    const message = err instanceof Error ? err.message : String(err);</w:t>
-        <w:br/>
-        <w:t xml:space="preserve">    if (</w:t>
-        <w:br/>
-        <w:t xml:space="preserve">      message === 'SHARE_TIMEOUT' ||</w:t>
-        <w:br/>
-        <w:t xml:space="preserve">      /cancel|dismiss|abort|closed|user/i.test(message)</w:t>
-        <w:br/>
-        <w:t xml:space="preserve">    ) {</w:t>
-        <w:br/>
-        <w:t xml:space="preserve">      return;</w:t>
+        <w:t xml:space="preserve">  if (records.length === 0) {</w:t>
+        <w:br/>
+        <w:t xml:space="preserve">    throw new Error('请至少选择一个数据集');</w:t>
+        <w:br/>
+        <w:t xml:space="preserve">  }</w:t>
+        <w:br/>
+        <w:br/>
+        <w:t xml:space="preserve">  if (Capacitor.isNativePlatform()) {</w:t>
+        <w:br/>
+        <w:t xml:space="preserve">    await exportDatasetNative(options);</w:t>
+        <w:br/>
+        <w:t xml:space="preserve">    return;</w:t>
+        <w:br/>
+        <w:t xml:space="preserve">  }</w:t>
+        <w:br/>
+        <w:br/>
+        <w:t xml:space="preserve">  await exportDatasetWeb(options);</w:t>
+        <w:br/>
+        <w:t>}</w:t>
+        <w:br/>
+        <w:br/>
+        <w:t>export async function takePhoto(source: 'prompt' | 'camera' = 'prompt'): Promise&lt;string&gt; {</w:t>
+        <w:br/>
+        <w:t xml:space="preserve">  const e2e = globalThis as { __E2E_PHOTO_URL__?: string; __E2E_PHOTO_QUEUE__?: string[] };</w:t>
+        <w:br/>
+        <w:t xml:space="preserve">  if (e2e.__E2E_PHOTO_QUEUE__ &amp;&amp; e2e.__E2E_PHOTO_QUEUE__.length &gt; 0) {</w:t>
+        <w:br/>
+        <w:t xml:space="preserve">    const next = e2e.__E2E_PHOTO_QUEUE__.shift();</w:t>
+        <w:br/>
+        <w:t xml:space="preserve">    if (next) {</w:t>
+        <w:br/>
+        <w:t xml:space="preserve">      return next;</w:t>
         <w:br/>
         <w:t xml:space="preserve">    }</w:t>
         <w:br/>
-        <w:t xml:space="preserve">    throw err;</w:t>
-        <w:br/>
         <w:t xml:space="preserve">  }</w:t>
         <w:br/>
-        <w:t>}</w:t>
-        <w:br/>
-        <w:br/>
-        <w:t>export async function exportDatasetWeb(options: ExportOptions): Promise&lt;void&gt; {</w:t>
-        <w:br/>
-        <w:t xml:space="preserve">  const { records, datasetName } = options;</w:t>
-        <w:br/>
-        <w:t xml:space="preserve">  const safeName = sanitizeExportName(datasetName);</w:t>
-        <w:br/>
-        <w:t xml:space="preserve">  const bundle = await buildExportBundle(records, safeName);</w:t>
-        <w:br/>
-        <w:t xml:space="preserve">  const exportRecords = await Promise.all(</w:t>
-        <w:br/>
-        <w:t xml:space="preserve">    bundle.records.map(async (meta, index) =&gt; ({</w:t>
-        <w:br/>
-        <w:t xml:space="preserve">      ...meta,</w:t>
-        <w:br/>
-        <w:t xml:space="preserve">      imageBase64: dataUrlToBase64(await resolveRecordPhoto(records[index])),</w:t>
-        <w:br/>
-        <w:t xml:space="preserve">    })),</w:t>
-        <w:br/>
-        <w:t xml:space="preserve">  );</w:t>
-        <w:br/>
-        <w:t xml:space="preserve">  const exportData = {</w:t>
-        <w:br/>
-        <w:t xml:space="preserve">    ...bundle,</w:t>
-        <w:br/>
-        <w:t xml:space="preserve">    records: exportRecords,</w:t>
-        <w:br/>
-        <w:t xml:space="preserve">  };</w:t>
-        <w:br/>
-        <w:br/>
-        <w:t xml:space="preserve">  const blob = new Blob([JSON.stringify(exportData, null, 2)], {</w:t>
-        <w:br/>
-        <w:t xml:space="preserve">    type: 'application/json',</w:t>
-        <w:br/>
-        <w:t xml:space="preserve">  });</w:t>
-        <w:br/>
-        <w:t xml:space="preserve">  const url = URL.createObjectURL(blob);</w:t>
-        <w:br/>
-        <w:t xml:space="preserve">  const anchor = document.createElement('a');</w:t>
-        <w:br/>
-        <w:t xml:space="preserve">  anchor.href = url;</w:t>
-        <w:br/>
-        <w:t xml:space="preserve">  anchor.download = `${safeName}.json`;</w:t>
-        <w:br/>
-        <w:t xml:space="preserve">  anchor.click();</w:t>
-        <w:br/>
-        <w:t xml:space="preserve">  URL.revokeObjectURL(url);</w:t>
-        <w:br/>
-        <w:t>}</w:t>
-        <w:br/>
-        <w:br/>
-        <w:t>export async function exportDataset(options: ExportOptions): Promise&lt;void&gt; {</w:t>
-        <w:br/>
-        <w:t xml:space="preserve">  const { records, datasetName } = options;</w:t>
-        <w:br/>
-        <w:br/>
-        <w:t xml:space="preserve">  if (!datasetName.trim()) {</w:t>
-        <w:br/>
-        <w:t xml:space="preserve">    throw new Error('请输入导出数据集名称');</w:t>
-        <w:br/>
-        <w:t xml:space="preserve">  }</w:t>
-        <w:br/>
-        <w:br/>
-        <w:t xml:space="preserve">  if (records.length === 0) {</w:t>
-        <w:br/>
-        <w:t xml:space="preserve">    throw new Error('请至少选择一个数据集');</w:t>
-        <w:br/>
-        <w:t xml:space="preserve">  }</w:t>
-        <w:br/>
-        <w:br/>
-        <w:t xml:space="preserve">  if (Capacitor.isNativePlatform()) {</w:t>
-        <w:br/>
-        <w:t xml:space="preserve">    await exportDatasetNative(options);</w:t>
-        <w:br/>
-        <w:t xml:space="preserve">    return;</w:t>
-        <w:br/>
-        <w:t xml:space="preserve">  }</w:t>
-        <w:br/>
-        <w:br/>
-        <w:t xml:space="preserve">  await exportDatasetWeb(options);</w:t>
-        <w:br/>
-        <w:t>}</w:t>
-        <w:br/>
-        <w:br/>
-        <w:t>export async function takePhoto(source: 'prompt' | 'camera' = 'prompt'): Promise&lt;string&gt; {</w:t>
-        <w:br/>
-        <w:t xml:space="preserve">  const e2ePhoto = (globalThis as { __E2E_PHOTO_URL__?: string }).__E2E_PHOTO_URL__;</w:t>
-        <w:br/>
-        <w:t xml:space="preserve">  if (e2ePhoto) {</w:t>
-        <w:br/>
-        <w:t xml:space="preserve">    return e2ePhoto;</w:t>
+        <w:t xml:space="preserve">  if (e2e.__E2E_PHOTO_URL__) {</w:t>
+        <w:br/>
+        <w:t xml:space="preserve">    return e2e.__E2E_PHOTO_URL__;</w:t>
         <w:br/>
         <w:t xml:space="preserve">  }</w:t>
         <w:br/>

</xml_diff>